<commit_message>
Materiais: Solicitação de férias (Anexo VII) com 70 dias de prazo no abono
A pedido do Paulo (28/09/2026): o rodapé dizia 60 dias antes do início para
a entrega com abono pecuniário, e a regra é 70. Trocado pelo Localizar e
substituir do Word (a formatação fica), com os metadados limpos. O RH Saúde
já imprime 70 no PDF.

Co-Authored-By: Claude Opus 5.5 <noreply@anthropic.com>
</commit_message>
<xml_diff>
--- a/MATERIAIS PUBLICADOS/RH E SERVIDOR/Solicitação de férias (Anexo VII).docx
+++ b/MATERIAIS PUBLICADOS/RH E SERVIDOR/Solicitação de férias (Anexo VII).docx
@@ -784,13 +784,19 @@
       <w:rPr>
         <w:rFonts w:ascii="Arial" w:hAnsi="Arial" w:cs="Arial"/>
       </w:rPr>
-      <w:t xml:space="preserve">, a entrega deverá ocorrer com 60 dias </w:t>
-    </w:r>
-    <w:r>
-      <w:rPr>
-        <w:rFonts w:ascii="Arial" w:hAnsi="Arial" w:cs="Arial"/>
-      </w:rPr>
-      <w:t>anteriores d</w:t>
+      <w:t xml:space="preserve">, a entrega deverá ocorrer com </w:t>
+    </w:r>
+    <w:r>
+      <w:rPr>
+        <w:rFonts w:ascii="Arial" w:hAnsi="Arial" w:cs="Arial"/>
+      </w:rPr>
+      <w:t>70 dias anteriores</w:t>
+    </w:r>
+    <w:r>
+      <w:rPr>
+        <w:rFonts w:ascii="Arial" w:hAnsi="Arial" w:cs="Arial"/>
+      </w:rPr>
+      <w:t xml:space="preserve"> d</w:t>
     </w:r>
     <w:r>
       <w:rPr>

</xml_diff>

<commit_message>
Materiais: Solicitação de férias (Anexo VII) com a data em 2026
A linha da data dizia "de 2025". Trocado pelo Localizar e substituir do Word,
com os metadados limpos, a pedido do Paulo (28/09/2026).

Co-Authored-By: Claude Opus 5.5 <noreply@anthropic.com>
</commit_message>
<xml_diff>
--- a/MATERIAIS PUBLICADOS/RH E SERVIDOR/Solicitação de férias (Anexo VII).docx
+++ b/MATERIAIS PUBLICADOS/RH E SERVIDOR/Solicitação de férias (Anexo VII).docx
@@ -66,7 +66,7 @@
           <w:sz w:val="24"/>
           <w:szCs w:val="24"/>
         </w:rPr>
-        <w:t xml:space="preserve"> de 202</w:t>
+        <w:t xml:space="preserve"> </w:t>
       </w:r>
       <w:r>
         <w:rPr>
@@ -74,7 +74,7 @@
           <w:sz w:val="24"/>
           <w:szCs w:val="24"/>
         </w:rPr>
-        <w:t>5</w:t>
+        <w:t>de 2026</w:t>
       </w:r>
       <w:r>
         <w:rPr>

</xml_diff>